<commit_message>
Modificacion de documentacion y agregado de imagenes del hardware
</commit_message>
<xml_diff>
--- a/docs/Bibliografia.docx
+++ b/docs/Bibliografia.docx
@@ -52,15 +52,6 @@
       <w:pPr>
         <w:spacing w:line="276" w:lineRule="auto"/>
         <w:rPr>
-          <w:sz w:val="22"/>
-          <w:szCs w:val="22"/>
-        </w:rPr>
-      </w:pPr>
-    </w:p>
-    <w:p>
-      <w:pPr>
-        <w:spacing w:line="276" w:lineRule="auto"/>
-        <w:rPr>
           <w:b/>
           <w:bCs/>
           <w:sz w:val="22"/>
@@ -107,15 +98,6 @@
       <w:pPr>
         <w:spacing w:line="276" w:lineRule="auto"/>
         <w:rPr>
-          <w:sz w:val="22"/>
-          <w:szCs w:val="22"/>
-        </w:rPr>
-      </w:pPr>
-    </w:p>
-    <w:p>
-      <w:pPr>
-        <w:spacing w:line="276" w:lineRule="auto"/>
-        <w:rPr>
           <w:b/>
           <w:bCs/>
           <w:sz w:val="22"/>
@@ -182,15 +164,6 @@
       <w:pPr>
         <w:spacing w:line="276" w:lineRule="auto"/>
         <w:rPr>
-          <w:sz w:val="22"/>
-          <w:szCs w:val="22"/>
-        </w:rPr>
-      </w:pPr>
-    </w:p>
-    <w:p>
-      <w:pPr>
-        <w:spacing w:line="276" w:lineRule="auto"/>
-        <w:rPr>
           <w:b/>
           <w:bCs/>
           <w:sz w:val="22"/>
@@ -323,64 +296,21 @@
         </w:rPr>
         <w:t xml:space="preserve"> </w:t>
       </w:r>
-    </w:p>
-    <w:p>
-      <w:pPr>
-        <w:spacing w:line="276" w:lineRule="auto"/>
-        <w:rPr>
-          <w:sz w:val="22"/>
-          <w:szCs w:val="22"/>
-        </w:rPr>
-      </w:pPr>
-    </w:p>
-    <w:p>
-      <w:pPr>
-        <w:spacing w:line="276" w:lineRule="auto"/>
-        <w:rPr>
-          <w:sz w:val="22"/>
-          <w:szCs w:val="22"/>
-        </w:rPr>
-      </w:pPr>
-      <w:r>
-        <w:rPr>
-          <w:sz w:val="22"/>
-          <w:szCs w:val="22"/>
-        </w:rPr>
-        <w:t>Links de compra, pantallas par</w:t>
-      </w:r>
-      <w:r>
-        <w:rPr>
-          <w:sz w:val="22"/>
-          <w:szCs w:val="22"/>
-        </w:rPr>
-        <w:t xml:space="preserve">a </w:t>
-      </w:r>
-      <w:r>
-        <w:rPr>
-          <w:sz w:val="22"/>
-          <w:szCs w:val="22"/>
-        </w:rPr>
-        <w:t>esp32</w:t>
-      </w:r>
-    </w:p>
-    <w:p>
-      <w:pPr>
-        <w:spacing w:line="276" w:lineRule="auto"/>
-        <w:rPr>
-          <w:b/>
-          <w:bCs/>
-          <w:sz w:val="22"/>
-          <w:szCs w:val="22"/>
-        </w:rPr>
-      </w:pPr>
-      <w:r>
-        <w:rPr>
-          <w:b/>
-          <w:bCs/>
-          <w:sz w:val="22"/>
-          <w:szCs w:val="22"/>
-        </w:rPr>
-        <w:t>Pantalla Redonda TFT IPS de 1.28" para Arduino</w:t>
+      <w:r>
+        <w:rPr>
+          <w:sz w:val="22"/>
+          <w:szCs w:val="22"/>
+        </w:rPr>
+        <w:br/>
+      </w:r>
+      <w:r>
+        <w:rPr>
+          <w:b/>
+          <w:bCs/>
+          <w:sz w:val="22"/>
+          <w:szCs w:val="22"/>
+        </w:rPr>
+        <w:t>Encontré la MEJOR pantalla GC9A01 para mi proyecto de reloj inteligente Arduino</w:t>
       </w:r>
     </w:p>
     <w:p>
@@ -398,23 +328,101 @@
             <w:sz w:val="22"/>
             <w:szCs w:val="22"/>
           </w:rPr>
-          <w:t>https://www.mercadolibre.com.ar/pantalla-redonda-tft-ips-de-128-para-arduino/p/MLA57346102?pdp_filters=item_id%3AMLA2384718800#polycard_client=search</w:t>
+          <w:t>https://www.youtube.com/watch?v=fVSIpsuMwEQ</w:t>
         </w:r>
+      </w:hyperlink>
+      <w:r>
+        <w:rPr>
+          <w:sz w:val="22"/>
+          <w:szCs w:val="22"/>
+        </w:rPr>
+        <w:t xml:space="preserve"> </w:t>
+      </w:r>
+    </w:p>
+    <w:p>
+      <w:pPr>
+        <w:spacing w:line="276" w:lineRule="auto"/>
+        <w:rPr>
+          <w:sz w:val="22"/>
+          <w:szCs w:val="22"/>
+        </w:rPr>
+      </w:pPr>
+    </w:p>
+    <w:p>
+      <w:pPr>
+        <w:spacing w:line="276" w:lineRule="auto"/>
+        <w:rPr>
+          <w:sz w:val="22"/>
+          <w:szCs w:val="22"/>
+        </w:rPr>
+      </w:pPr>
+    </w:p>
+    <w:p>
+      <w:pPr>
+        <w:spacing w:line="276" w:lineRule="auto"/>
+        <w:rPr>
+          <w:sz w:val="22"/>
+          <w:szCs w:val="22"/>
+        </w:rPr>
+      </w:pPr>
+      <w:r>
+        <w:rPr>
+          <w:sz w:val="22"/>
+          <w:szCs w:val="22"/>
+        </w:rPr>
+        <w:t>Links de compra, pantallas par</w:t>
+      </w:r>
+      <w:r>
+        <w:rPr>
+          <w:sz w:val="22"/>
+          <w:szCs w:val="22"/>
+        </w:rPr>
+        <w:t xml:space="preserve">a </w:t>
+      </w:r>
+      <w:r>
+        <w:rPr>
+          <w:sz w:val="22"/>
+          <w:szCs w:val="22"/>
+        </w:rPr>
+        <w:t>esp32</w:t>
+      </w:r>
+    </w:p>
+    <w:p>
+      <w:pPr>
+        <w:spacing w:line="276" w:lineRule="auto"/>
+        <w:rPr>
+          <w:b/>
+          <w:bCs/>
+          <w:sz w:val="22"/>
+          <w:szCs w:val="22"/>
+        </w:rPr>
+      </w:pPr>
+      <w:r>
+        <w:rPr>
+          <w:b/>
+          <w:bCs/>
+          <w:sz w:val="22"/>
+          <w:szCs w:val="22"/>
+        </w:rPr>
+        <w:t>Pantalla Redonda TFT IPS de 1.28" para Arduino</w:t>
+      </w:r>
+    </w:p>
+    <w:p>
+      <w:pPr>
+        <w:spacing w:line="276" w:lineRule="auto"/>
+        <w:rPr>
+          <w:sz w:val="22"/>
+          <w:szCs w:val="22"/>
+        </w:rPr>
+      </w:pPr>
+      <w:hyperlink r:id="rId10" w:anchor="polycard_client=search-desktop&amp;be_origin=searchv2&amp;overlay_label=not_apply&amp;search_layout=grid&amp;position=1&amp;type=product&amp;tracking_id=99ad3810-ab76-4b16-8205-8c063afd1caa&amp;wid=MLA2384718800&amp;sid=search" w:history="1">
         <w:r>
           <w:rPr>
             <w:rStyle w:val="Hipervnculo"/>
             <w:sz w:val="22"/>
             <w:szCs w:val="22"/>
           </w:rPr>
-          <w:t>-</w:t>
-        </w:r>
-        <w:r>
-          <w:rPr>
-            <w:rStyle w:val="Hipervnculo"/>
-            <w:sz w:val="22"/>
-            <w:szCs w:val="22"/>
-          </w:rPr>
-          <w:t>desktop&amp;be_origin=searchv2&amp;overlay_label=not_apply&amp;search_layout=grid&amp;position=1&amp;type=product&amp;tracking_id=99ad3810-ab76-4b16-8205-8c063afd1caa&amp;wid=MLA2384718800&amp;sid=search</w:t>
+          <w:t>https://www.mercadolibre.com.ar/pantalla-redonda-tft-ips-de-128-para-arduino/p/MLA57346102?pdp_filters=item_id%3AMLA2384718800#polycard_client=search-desktop&amp;be_origin=searchv2&amp;overlay_label=not_apply&amp;search_layout=grid&amp;position=1&amp;type=product&amp;tracking_id=99ad3810-ab76-4b16-8205-8c063afd1caa&amp;wid=MLA2384718800&amp;sid=search</w:t>
         </w:r>
       </w:hyperlink>
       <w:r>
@@ -522,27 +530,18 @@
           <w:sz w:val="22"/>
           <w:szCs w:val="22"/>
         </w:rPr>
-        <w:t xml:space="preserve"> De Carga</w:t>
-      </w:r>
-      <w:r>
-        <w:rPr>
-          <w:b/>
-          <w:bCs/>
-          <w:sz w:val="22"/>
-          <w:szCs w:val="22"/>
-        </w:rPr>
-        <w:t xml:space="preserve"> </w:t>
-      </w:r>
-    </w:p>
-    <w:p>
-      <w:pPr>
-        <w:spacing w:line="276" w:lineRule="auto"/>
-        <w:rPr>
-          <w:sz w:val="22"/>
-          <w:szCs w:val="22"/>
-        </w:rPr>
-      </w:pPr>
-      <w:hyperlink r:id="rId10" w:history="1">
+        <w:t xml:space="preserve"> De Carga </w:t>
+      </w:r>
+    </w:p>
+    <w:p>
+      <w:pPr>
+        <w:spacing w:line="276" w:lineRule="auto"/>
+        <w:rPr>
+          <w:sz w:val="22"/>
+          <w:szCs w:val="22"/>
+        </w:rPr>
+      </w:pPr>
+      <w:hyperlink r:id="rId11" w:anchor="polycard_client=search-desktop&amp;float_highlight=last_units&amp;be_origin=searchv2&amp;overlay_label=not_apply&amp;search_layout=grid&amp;position=31&amp;type=product&amp;tracking_id=6ebbc220-d2dd-410c-9154-f10057eb49e2&amp;wid=MLA3178650964&amp;sid=search" w:history="1">
         <w:r>
           <w:rPr>
             <w:rStyle w:val="Hipervnculo"/>
@@ -697,7 +696,7 @@
           <w:szCs w:val="22"/>
         </w:rPr>
       </w:pPr>
-      <w:hyperlink r:id="rId11" w:history="1">
+      <w:hyperlink r:id="rId12" w:anchor="polycard_client=search-desktop&amp;be_origin=searchv2&amp;overlay_label=not_apply&amp;search_layout=grid&amp;position=30&amp;type=product&amp;tracking_id=6ebbc220-d2dd-410c-9154-f10057eb49e2&amp;wid=MLA3458539792&amp;sid=search" w:history="1">
         <w:r>
           <w:rPr>
             <w:rStyle w:val="Hipervnculo"/>

</xml_diff>